<commit_message>
docs: humanize distributed materials, strip AI-style dashes and fix stray text artifacts
Replaces em/en dashes used as sentence connectors across the request email,
newspaper article, company profile, attack worksheets, budget/RoS sheets and
event cards with periods, commas or colons, keeping the dash only where it
marks a genuine numeric range. Also removes leftover text fragments glued
onto unrelated lines from earlier edits (duplicated "Prototyping und
Kleinserien für OEMs" bullet, "AnAls", "IIm", "relevantCNC-gefräste...").

Co-Authored-By: Claude Sonnet 5 <noreply@anthropic.com>
</commit_message>
<xml_diff>
--- a/final_documents/Angriff-2_OT-Störung.docx
+++ b/final_documents/Angriff-2_OT-Störung.docx
@@ -61,7 +61,7 @@
           <w:szCs w:val="20"/>
           <w:highlight w:val="none"/>
         </w:rPr>
-        <w:t xml:space="preserve">In eurer Produktionssteuerung wurde eine Schwachstelle ausgenutzt – die Angreifer zielen darauf, die Fertigung zu stören bzw. stillzulegen. Ob die Produktion wirklich ausfällt und wie stark die Auswirkungen sind, ermittelt ihr im nächsten Schritt anhand eur</w:t>
+        <w:t>In eurer Produktionssteuerung wurde eine Schwachstelle ausgenutzt. Die Angreifer zielen darauf, die Fertigung zu stören bzw. stillzulegen. Ob die Produktion wirklich ausfällt und wie stark die Auswirkungen sind, ermittelt ihr im nächsten Schritt anhand eur</w:t>
       </w:r>
       <w:r>
         <w:rPr>
@@ -2004,7 +2004,7 @@
                 <w:szCs w:val="20"/>
                 <w:highlight w:val="none"/>
               </w:rPr>
-              <w:t xml:space="preserve">M5 – Netz-Segmentierung</w:t>
+              <w:t>M5 - Netz-Segmentierung</w:t>
             </w:r>
             <w:r>
               <w:rPr>
@@ -2213,7 +2213,7 @@
                 <w:szCs w:val="20"/>
                 <w:highlight w:val="none"/>
               </w:rPr>
-              <w:t xml:space="preserve">M7 – Patch Management</w:t>
+              <w:t>M7 - Patch Management</w:t>
             </w:r>
             <w:r>
               <w:rPr>

</xml_diff>